<commit_message>
Add strict C89 port of the SNOBOL4 interpreter (c/), benchmarks, manual chapter
Port of the CREXX interpreter to portable C89 for VM/370: amalgamated
snobol_all.c, 71-column deck, strict/sanitizer/-m32 checks, identical output
on the shared tests, CREXX real-number printing and integer overflow
behaviour reproduced. Adds bench/ programs and a chapter in the manual.

Co-Authored-By: Claude Sonnet 5.5 <noreply@anthropic.com>
Claude-Session: https://claude.ai/code/session_013PfZHD8os4FWhvmVG9Tf7M
</commit_message>
<xml_diff>
--- a/docs/SNOBOL-CREXX-Guide.docx
+++ b/docs/SNOBOL-CREXX-Guide.docx
@@ -1355,7 +1355,102 @@
           <w:sz w:val="19"/>
           <w:szCs w:val="19"/>
         </w:rPr>
-        <w:t xml:space="preserve">Appendix A. Command Summary	21</w:t>
+        <w:t xml:space="preserve">Chapter 11. The C Version	21</w:t>
+      </w:r>
+    </w:p>
+    <w:p>
+      <w:pPr>
+        <w:tabs>
+          <w:tab w:val="right" w:pos="9638" w:leader="dot"/>
+        </w:tabs>
+        <w:spacing w:after="0" w:before="0"/>
+        <w:ind w:left="360"/>
+      </w:pPr>
+      <w:r>
+        <w:rPr>
+          <w:rFonts w:ascii="Arial" w:cs="Arial" w:eastAsia="Arial" w:hAnsi="Arial"/>
+          <w:b w:val="false"/>
+          <w:bCs w:val="false"/>
+          <w:sz w:val="18"/>
+          <w:szCs w:val="18"/>
+        </w:rPr>
+        <w:t xml:space="preserve">Building and testing	21</w:t>
+      </w:r>
+    </w:p>
+    <w:p>
+      <w:pPr>
+        <w:tabs>
+          <w:tab w:val="right" w:pos="9638" w:leader="dot"/>
+        </w:tabs>
+        <w:spacing w:after="0" w:before="0"/>
+        <w:ind w:left="360"/>
+      </w:pPr>
+      <w:r>
+        <w:rPr>
+          <w:rFonts w:ascii="Arial" w:cs="Arial" w:eastAsia="Arial" w:hAnsi="Arial"/>
+          <w:b w:val="false"/>
+          <w:bCs w:val="false"/>
+          <w:sz w:val="18"/>
+          <w:szCs w:val="18"/>
+        </w:rPr>
+        <w:t xml:space="preserve">Portability rules	21</w:t>
+      </w:r>
+    </w:p>
+    <w:p>
+      <w:pPr>
+        <w:tabs>
+          <w:tab w:val="right" w:pos="9638" w:leader="dot"/>
+        </w:tabs>
+        <w:spacing w:after="0" w:before="0"/>
+        <w:ind w:left="360"/>
+      </w:pPr>
+      <w:r>
+        <w:rPr>
+          <w:rFonts w:ascii="Arial" w:cs="Arial" w:eastAsia="Arial" w:hAnsi="Arial"/>
+          <w:b w:val="false"/>
+          <w:bCs w:val="false"/>
+          <w:sz w:val="18"/>
+          <w:szCs w:val="18"/>
+        </w:rPr>
+        <w:t xml:space="preserve">Numbers and output	21</w:t>
+      </w:r>
+    </w:p>
+    <w:p>
+      <w:pPr>
+        <w:tabs>
+          <w:tab w:val="right" w:pos="9638" w:leader="dot"/>
+        </w:tabs>
+        <w:spacing w:after="0" w:before="0"/>
+        <w:ind w:left="360"/>
+      </w:pPr>
+      <w:r>
+        <w:rPr>
+          <w:rFonts w:ascii="Arial" w:cs="Arial" w:eastAsia="Arial" w:hAnsi="Arial"/>
+          <w:b w:val="false"/>
+          <w:bCs w:val="false"/>
+          <w:sz w:val="18"/>
+          <w:szCs w:val="18"/>
+        </w:rPr>
+        <w:t xml:space="preserve">Differences from the CREXX version	21</w:t>
+      </w:r>
+    </w:p>
+    <w:p>
+      <w:pPr>
+        <w:tabs>
+          <w:tab w:val="right" w:pos="9638" w:leader="dot"/>
+        </w:tabs>
+        <w:spacing w:after="0" w:before="0"/>
+        <w:ind w:left="360"/>
+      </w:pPr>
+      <w:r>
+        <w:rPr>
+          <w:rFonts w:ascii="Arial" w:cs="Arial" w:eastAsia="Arial" w:hAnsi="Arial"/>
+          <w:b w:val="false"/>
+          <w:bCs w:val="false"/>
+          <w:sz w:val="18"/>
+          <w:szCs w:val="18"/>
+        </w:rPr>
+        <w:t xml:space="preserve">Benchmarks	22</w:t>
       </w:r>
     </w:p>
     <w:p>
@@ -1374,7 +1469,7 @@
           <w:sz w:val="19"/>
           <w:szCs w:val="19"/>
         </w:rPr>
-        <w:t xml:space="preserve">Appendix B. Contents of the Repository	22</w:t>
+        <w:t xml:space="preserve">Appendix A. Command Summary	23</w:t>
       </w:r>
     </w:p>
     <w:p>
@@ -1393,7 +1488,7 @@
           <w:sz w:val="19"/>
           <w:szCs w:val="19"/>
         </w:rPr>
-        <w:t xml:space="preserve">Appendix C. Keywords	23</w:t>
+        <w:t xml:space="preserve">Appendix B. Contents of the Repository	24</w:t>
       </w:r>
     </w:p>
     <w:p>
@@ -1412,7 +1507,26 @@
           <w:sz w:val="19"/>
           <w:szCs w:val="19"/>
         </w:rPr>
-        <w:t xml:space="preserve">Appendix D. Sample Programs	24</w:t>
+        <w:t xml:space="preserve">Appendix C. Keywords	25</w:t>
+      </w:r>
+    </w:p>
+    <w:p>
+      <w:pPr>
+        <w:tabs>
+          <w:tab w:val="right" w:pos="9638" w:leader="dot"/>
+        </w:tabs>
+        <w:spacing w:after="20" w:before="100"/>
+        <w:ind w:left="0"/>
+      </w:pPr>
+      <w:r>
+        <w:rPr>
+          <w:rFonts w:ascii="Arial" w:cs="Arial" w:eastAsia="Arial" w:hAnsi="Arial"/>
+          <w:b/>
+          <w:bCs/>
+          <w:sz w:val="19"/>
+          <w:szCs w:val="19"/>
+        </w:rPr>
+        <w:t xml:space="preserve">Appendix D. Sample Programs	26</w:t>
       </w:r>
     </w:p>
     <w:p>
@@ -1767,6 +1881,34 @@
           <w:szCs w:val="20"/>
         </w:rPr>
         <w:t xml:space="preserve">, lists what does not work yet.</w:t>
+      </w:r>
+    </w:p>
+    <w:p>
+      <w:pPr>
+        <w:pStyle w:val="ListParagraph"/>
+        <w:numPr>
+          <w:ilvl w:val="0"/>
+          <w:numId w:val="2"/>
+        </w:numPr>
+        <w:spacing w:after="80"/>
+      </w:pPr>
+      <w:r>
+        <w:rPr>
+          <w:rFonts w:ascii="Arial" w:cs="Arial" w:eastAsia="Arial" w:hAnsi="Arial"/>
+          <w:b/>
+          <w:bCs/>
+          <w:sz w:val="20"/>
+          <w:szCs w:val="20"/>
+        </w:rPr>
+        <w:t xml:space="preserve">Chapter 11, The C Version</w:t>
+      </w:r>
+      <w:r>
+        <w:rPr>
+          <w:rFonts w:ascii="Arial" w:cs="Arial" w:eastAsia="Arial" w:hAnsi="Arial"/>
+          <w:sz w:val="20"/>
+          <w:szCs w:val="20"/>
+        </w:rPr>
+        <w:t xml:space="preserve">, describes the portable C89 version of the interpreter, how to build and test it, and how it differs from the CREXX version.</w:t>
       </w:r>
     </w:p>
     <w:p>
@@ -18666,7 +18808,7 @@
           <w:sz w:val="20"/>
           <w:szCs w:val="20"/>
         </w:rPr>
-        <w:t xml:space="preserve"> are 64-bit and overflow is not detected.</w:t>
+        <w:t xml:space="preserve"> are 64-bit (the width of a CREXX integer). Overflow is not reported as an error: the CREXX virtual machine drops the result of an overflowing addition, subtraction or multiplication and the interpreter then uses the previous result of the same operation (0 at first), so 9223372036854775807 + 1 gives 0 on a fresh run. The C version imitates this exactly.</w:t>
       </w:r>
     </w:p>
     <w:p>
@@ -18686,7 +18828,7 @@
           <w:sz w:val="20"/>
           <w:szCs w:val="20"/>
         </w:rPr>
-        <w:t xml:space="preserve">CODE objects</w:t>
+        <w:t xml:space="preserve">Two CREXX defects.</w:t>
       </w:r>
       <w:r>
         <w:rPr>
@@ -18694,7 +18836,7 @@
           <w:sz w:val="20"/>
           <w:szCs w:val="20"/>
         </w:rPr>
-        <w:t xml:space="preserve"> run to the end of the program: when the compiled statements are used up, the program ends.</w:t>
+        <w:t xml:space="preserve"> In snobol.crexx, ITEM(A, i) on an array and EVAL of an unevaluated expression value (*X, or CONVERT(s, 'EXPRESSION')) with sub-expressions misbehave, because a global register is passed as a parameter and changes under the callee. A literal of 19 or more digits, a real string such as 1e999 and a huge real passed to LEN or SUBSTR stop the program with a CREXX PANIC. The C version evaluates these correctly (a literal that is too large becomes a real; the others are errors).</w:t>
       </w:r>
     </w:p>
     <w:p>
@@ -18714,7 +18856,7 @@
           <w:sz w:val="20"/>
           <w:szCs w:val="20"/>
         </w:rPr>
-        <w:t xml:space="preserve">Side effects in patterns.</w:t>
+        <w:t xml:space="preserve">CODE objects</w:t>
       </w:r>
       <w:r>
         <w:rPr>
@@ -18722,7 +18864,7 @@
           <w:sz w:val="20"/>
           <w:szCs w:val="20"/>
         </w:rPr>
-        <w:t xml:space="preserve"> A function called from a pattern with *F() is not undone when the matcher backs up, as in other implementations.</w:t>
+        <w:t xml:space="preserve"> run to the end of the program: when the compiled statements are used up, the program ends.</w:t>
       </w:r>
     </w:p>
     <w:p>
@@ -18742,7 +18884,7 @@
           <w:sz w:val="20"/>
           <w:szCs w:val="20"/>
         </w:rPr>
-        <w:t xml:space="preserve">Speed.</w:t>
+        <w:t xml:space="preserve">Side effects in patterns.</w:t>
       </w:r>
       <w:r>
         <w:rPr>
@@ -18750,7 +18892,7 @@
           <w:sz w:val="20"/>
           <w:szCs w:val="20"/>
         </w:rPr>
-        <w:t xml:space="preserve"> The interpreter is a program running on a virtual machine. Typical statements take a few microseconds; heavy pattern matching on very long strings is slower than in compiled SNOBOL4.</w:t>
+        <w:t xml:space="preserve"> A function called from a pattern with *F() is not undone when the matcher backs up, as in other implementations.</w:t>
       </w:r>
     </w:p>
     <w:p>
@@ -18770,7 +18912,7 @@
           <w:sz w:val="20"/>
           <w:szCs w:val="20"/>
         </w:rPr>
-        <w:t xml:space="preserve">DATE</w:t>
+        <w:t xml:space="preserve">Speed.</w:t>
       </w:r>
       <w:r>
         <w:rPr>
@@ -18778,7 +18920,7 @@
           <w:sz w:val="20"/>
           <w:szCs w:val="20"/>
         </w:rPr>
-        <w:t xml:space="preserve"> returns a fixed string.</w:t>
+        <w:t xml:space="preserve"> The interpreter is a program running on a virtual machine. Typical statements take a few microseconds; heavy pattern matching on very long strings is slower than in compiled SNOBOL4.</w:t>
       </w:r>
     </w:p>
     <w:p>
@@ -18798,6 +18940,34 @@
           <w:sz w:val="20"/>
           <w:szCs w:val="20"/>
         </w:rPr>
+        <w:t xml:space="preserve">DATE</w:t>
+      </w:r>
+      <w:r>
+        <w:rPr>
+          <w:rFonts w:ascii="Arial" w:cs="Arial" w:eastAsia="Arial" w:hAnsi="Arial"/>
+          <w:sz w:val="20"/>
+          <w:szCs w:val="20"/>
+        </w:rPr>
+        <w:t xml:space="preserve"> returns a fixed string.</w:t>
+      </w:r>
+    </w:p>
+    <w:p>
+      <w:pPr>
+        <w:pStyle w:val="ListParagraph"/>
+        <w:numPr>
+          <w:ilvl w:val="0"/>
+          <w:numId w:val="2"/>
+        </w:numPr>
+        <w:spacing w:after="80"/>
+      </w:pPr>
+      <w:r>
+        <w:rPr>
+          <w:rFonts w:ascii="Arial" w:cs="Arial" w:eastAsia="Arial" w:hAnsi="Arial"/>
+          <w:b/>
+          <w:bCs/>
+          <w:sz w:val="20"/>
+          <w:szCs w:val="20"/>
+        </w:rPr>
         <w:t xml:space="preserve">Case.</w:t>
       </w:r>
       <w:r>
@@ -18826,7 +18996,36 @@
           <w:sz w:val="32"/>
           <w:szCs w:val="32"/>
         </w:rPr>
-        <w:t xml:space="preserve">Appendix A. Command Summary</w:t>
+        <w:t xml:space="preserve">Chapter 11. The C Version</w:t>
+      </w:r>
+    </w:p>
+    <w:p>
+      <w:pPr>
+        <w:spacing w:after="120" w:line="264"/>
+      </w:pPr>
+      <w:r>
+        <w:rPr>
+          <w:rFonts w:ascii="Arial" w:cs="Arial" w:eastAsia="Arial" w:hAnsi="Arial"/>
+          <w:sz w:val="20"/>
+          <w:szCs w:val="20"/>
+        </w:rPr>
+        <w:t xml:space="preserve">The directory c of the repository holds a second implementation of the same interpreter, written in strict C89. It was written so that SNOBOL4 can run on VM/370 (CMS), where only a small C compiler is available, and it follows the layout and rules of the other C ports in the author's repositories (apl, Smalltalk, Python). It is a direct port of the CREXX sources: the same parser, the same backtracking matcher, the same evaluator, the same error numbers and messages. It passes the regression tests of this repository with output identical to that of the CREXX version, and starts in a few milliseconds.</w:t>
+      </w:r>
+    </w:p>
+    <w:p>
+      <w:pPr>
+        <w:pStyle w:val="Heading2"/>
+        <w:keepNext/>
+      </w:pPr>
+      <w:r>
+        <w:rPr>
+          <w:rFonts w:ascii="Arial" w:cs="Arial" w:eastAsia="Arial" w:hAnsi="Arial"/>
+          <w:b/>
+          <w:bCs/>
+          <w:sz w:val="24"/>
+          <w:szCs w:val="24"/>
+        </w:rPr>
+        <w:t xml:space="preserve">Building and testing</w:t>
       </w:r>
     </w:p>
     <w:p>
@@ -18848,7 +19047,7 @@
           <w:sz w:val="17"/>
           <w:szCs w:val="17"/>
         </w:rPr>
-        <w:t xml:space="preserve">./snobol [-f] program.sno</w:t>
+        <w:t xml:space="preserve">cd c</w:t>
       </w:r>
     </w:p>
     <w:p>
@@ -18869,7 +19068,7 @@
           <w:sz w:val="17"/>
           <w:szCs w:val="17"/>
         </w:rPr>
-        <w:t xml:space="preserve">crexx snobol.crexx -nocompile -args [-f] program.sno</w:t>
+        <w:t xml:space="preserve">make                 # builds ./snobol from the single file snobol_all.c</w:t>
       </w:r>
     </w:p>
     <w:p>
@@ -18890,7 +19089,7 @@
           <w:sz w:val="17"/>
           <w:szCs w:val="17"/>
         </w:rPr>
-        <w:t xml:space="preserve"> </w:t>
+        <w:t xml:space="preserve">make test            # runs ../tests against ./snobol</w:t>
       </w:r>
     </w:p>
     <w:p>
@@ -18911,7 +19110,91 @@
           <w:sz w:val="17"/>
           <w:szCs w:val="17"/>
         </w:rPr>
-        <w:t xml:space="preserve">-f   fold names to upper case</w:t>
+        <w:t xml:space="preserve">./snobol [-f] prog.sno</w:t>
+      </w:r>
+    </w:p>
+    <w:p>
+      <w:pPr>
+        <w:keepNext/>
+        <w:keepLines/>
+        <w:pBdr>
+          <w:left w:val="single" w:color="808080" w:sz="4"/>
+          <w:right w:val="single" w:color="808080" w:sz="4"/>
+        </w:pBdr>
+        <w:shd w:fill="F2F2F2" w:color="auto" w:val="clear"/>
+        <w:spacing w:after="0" w:line="240"/>
+        <w:ind w:left="100" w:right="100"/>
+      </w:pPr>
+      <w:r>
+        <w:rPr>
+          <w:rFonts w:ascii="Courier New" w:cs="Courier New" w:eastAsia="Courier New" w:hAnsi="Courier New"/>
+          <w:sz w:val="17"/>
+          <w:szCs w:val="17"/>
+        </w:rPr>
+        <w:t xml:space="preserve"> </w:t>
+      </w:r>
+    </w:p>
+    <w:p>
+      <w:pPr>
+        <w:keepNext/>
+        <w:keepLines/>
+        <w:pBdr>
+          <w:left w:val="single" w:color="808080" w:sz="4"/>
+          <w:right w:val="single" w:color="808080" w:sz="4"/>
+        </w:pBdr>
+        <w:shd w:fill="F2F2F2" w:color="auto" w:val="clear"/>
+        <w:spacing w:after="0" w:line="240"/>
+        <w:ind w:left="100" w:right="100"/>
+      </w:pPr>
+      <w:r>
+        <w:rPr>
+          <w:rFonts w:ascii="Courier New" w:cs="Courier New" w:eastAsia="Courier New" w:hAnsi="Courier New"/>
+          <w:sz w:val="17"/>
+          <w:szCs w:val="17"/>
+        </w:rPr>
+        <w:t xml:space="preserve">make strict          # gcc and clang strict flags, sanitizers, 32-bit long</w:t>
+      </w:r>
+    </w:p>
+    <w:p>
+      <w:pPr>
+        <w:keepNext/>
+        <w:keepLines/>
+        <w:pBdr>
+          <w:left w:val="single" w:color="808080" w:sz="4"/>
+          <w:right w:val="single" w:color="808080" w:sz="4"/>
+        </w:pBdr>
+        <w:shd w:fill="F2F2F2" w:color="auto" w:val="clear"/>
+        <w:spacing w:after="0" w:line="240"/>
+        <w:ind w:left="100" w:right="100"/>
+      </w:pPr>
+      <w:r>
+        <w:rPr>
+          <w:rFonts w:ascii="Courier New" w:cs="Courier New" w:eastAsia="Courier New" w:hAnsi="Courier New"/>
+          <w:sz w:val="17"/>
+          <w:szCs w:val="17"/>
+        </w:rPr>
+        <w:t xml:space="preserve">make deck            # 71-column card images in deck/snobol_deck.c</w:t>
+      </w:r>
+    </w:p>
+    <w:p>
+      <w:pPr>
+        <w:keepNext/>
+        <w:keepLines/>
+        <w:pBdr>
+          <w:left w:val="single" w:color="808080" w:sz="4"/>
+          <w:right w:val="single" w:color="808080" w:sz="4"/>
+        </w:pBdr>
+        <w:shd w:fill="F2F2F2" w:color="auto" w:val="clear"/>
+        <w:spacing w:after="0" w:line="240"/>
+        <w:ind w:left="100" w:right="100"/>
+      </w:pPr>
+      <w:r>
+        <w:rPr>
+          <w:rFonts w:ascii="Courier New" w:cs="Courier New" w:eastAsia="Courier New" w:hAnsi="Courier New"/>
+          <w:sz w:val="17"/>
+          <w:szCs w:val="17"/>
+        </w:rPr>
+        <w:t xml:space="preserve">make deck-test       # runs the tests against the deck build</w:t>
       </w:r>
     </w:p>
     <w:p>
@@ -18933,7 +19216,7 @@
           <w:sz w:val="17"/>
           <w:szCs w:val="17"/>
         </w:rPr>
-        <w:t xml:space="preserve">-h   show usage</w:t>
+        <w:t xml:space="preserve">make bench           # runs ../bench with the C (and the CREXX) version</w:t>
       </w:r>
     </w:p>
     <w:p>
@@ -18949,6 +19232,567 @@
           <w:szCs w:val="18"/>
         </w:rPr>
         <w:t xml:space="preserve">Figure 38. </w:t>
+      </w:r>
+      <w:r>
+        <w:rPr>
+          <w:rFonts w:ascii="Arial" w:cs="Arial" w:eastAsia="Arial" w:hAnsi="Arial"/>
+          <w:sz w:val="18"/>
+          <w:szCs w:val="18"/>
+        </w:rPr>
+        <w:t xml:space="preserve">Building the C version</w:t>
+      </w:r>
+    </w:p>
+    <w:p>
+      <w:pPr>
+        <w:spacing w:after="120" w:line="264"/>
+      </w:pPr>
+      <w:r>
+        <w:rPr>
+          <w:rFonts w:ascii="Arial" w:cs="Arial" w:eastAsia="Arial" w:hAnsi="Arial"/>
+          <w:sz w:val="20"/>
+          <w:szCs w:val="20"/>
+        </w:rPr>
+        <w:t xml:space="preserve">The sources are in c/src, in seven parts (base and strings, values, parser, patterns, evaluator, built-in functions, main). tools/amalg.sh inlines them into one self-contained file, snobol_all.c, which is checked in so that the program builds with a single compiler command. tools/gen_consts.py regenerates the constant header from src/consts.txt and the function list of the CREXX sources, so that both versions share their numbering.</w:t>
+      </w:r>
+    </w:p>
+    <w:p>
+      <w:pPr>
+        <w:pStyle w:val="Heading2"/>
+        <w:keepNext/>
+      </w:pPr>
+      <w:r>
+        <w:rPr>
+          <w:rFonts w:ascii="Arial" w:cs="Arial" w:eastAsia="Arial" w:hAnsi="Arial"/>
+          <w:b/>
+          <w:bCs/>
+          <w:sz w:val="24"/>
+          <w:szCs w:val="24"/>
+        </w:rPr>
+        <w:t xml:space="preserve">Portability rules</w:t>
+      </w:r>
+    </w:p>
+    <w:p>
+      <w:pPr>
+        <w:pStyle w:val="ListParagraph"/>
+        <w:numPr>
+          <w:ilvl w:val="0"/>
+          <w:numId w:val="2"/>
+        </w:numPr>
+        <w:spacing w:after="80"/>
+      </w:pPr>
+      <w:r>
+        <w:rPr>
+          <w:rFonts w:ascii="Arial" w:cs="Arial" w:eastAsia="Arial" w:hAnsi="Arial"/>
+          <w:b/>
+          <w:bCs/>
+          <w:sz w:val="20"/>
+          <w:szCs w:val="20"/>
+        </w:rPr>
+        <w:t xml:space="preserve">Strict C89.</w:t>
+      </w:r>
+      <w:r>
+        <w:rPr>
+          <w:rFonts w:ascii="Arial" w:cs="Arial" w:eastAsia="Arial" w:hAnsi="Arial"/>
+          <w:sz w:val="20"/>
+          <w:szCs w:val="20"/>
+        </w:rPr>
+        <w:t xml:space="preserve"> No // comments, no declarations after statements, no long long, no stdint.h and no C99 library functions. The program compiles without warnings under gcc and clang with -std=c89 -pedantic-errors -Wall -Wextra -Wconversion -Wshadow.</w:t>
+      </w:r>
+    </w:p>
+    <w:p>
+      <w:pPr>
+        <w:pStyle w:val="ListParagraph"/>
+        <w:numPr>
+          <w:ilvl w:val="0"/>
+          <w:numId w:val="2"/>
+        </w:numPr>
+        <w:spacing w:after="80"/>
+      </w:pPr>
+      <w:r>
+        <w:rPr>
+          <w:rFonts w:ascii="Arial" w:cs="Arial" w:eastAsia="Arial" w:hAnsi="Arial"/>
+          <w:b/>
+          <w:bCs/>
+          <w:sz w:val="20"/>
+          <w:szCs w:val="20"/>
+        </w:rPr>
+        <w:t xml:space="preserve">One external symbol.</w:t>
+      </w:r>
+      <w:r>
+        <w:rPr>
+          <w:rFonts w:ascii="Arial" w:cs="Arial" w:eastAsia="Arial" w:hAnsi="Arial"/>
+          <w:sz w:val="20"/>
+          <w:szCs w:val="20"/>
+        </w:rPr>
+        <w:t xml:space="preserve"> All functions are static except main, so that the eight-character external names of CMS are no problem.</w:t>
+      </w:r>
+    </w:p>
+    <w:p>
+      <w:pPr>
+        <w:pStyle w:val="ListParagraph"/>
+        <w:numPr>
+          <w:ilvl w:val="0"/>
+          <w:numId w:val="2"/>
+        </w:numPr>
+        <w:spacing w:after="80"/>
+      </w:pPr>
+      <w:r>
+        <w:rPr>
+          <w:rFonts w:ascii="Arial" w:cs="Arial" w:eastAsia="Arial" w:hAnsi="Arial"/>
+          <w:b/>
+          <w:bCs/>
+          <w:sz w:val="20"/>
+          <w:szCs w:val="20"/>
+        </w:rPr>
+        <w:t xml:space="preserve">EBCDIC safe.</w:t>
+      </w:r>
+      <w:r>
+        <w:rPr>
+          <w:rFonts w:ascii="Arial" w:cs="Arial" w:eastAsia="Arial" w:hAnsi="Arial"/>
+          <w:sz w:val="20"/>
+          <w:szCs w:val="20"/>
+        </w:rPr>
+        <w:t xml:space="preserve"> Character classes are literal character sets; nothing relies on the ASCII code points. Only the digits are tested with '0' to '9'.</w:t>
+      </w:r>
+    </w:p>
+    <w:p>
+      <w:pPr>
+        <w:pStyle w:val="ListParagraph"/>
+        <w:numPr>
+          <w:ilvl w:val="0"/>
+          <w:numId w:val="2"/>
+        </w:numPr>
+        <w:spacing w:after="80"/>
+      </w:pPr>
+      <w:r>
+        <w:rPr>
+          <w:rFonts w:ascii="Arial" w:cs="Arial" w:eastAsia="Arial" w:hAnsi="Arial"/>
+          <w:b/>
+          <w:bCs/>
+          <w:sz w:val="20"/>
+          <w:szCs w:val="20"/>
+        </w:rPr>
+        <w:t xml:space="preserve">32-bit long.</w:t>
+      </w:r>
+      <w:r>
+        <w:rPr>
+          <w:rFonts w:ascii="Arial" w:cs="Arial" w:eastAsia="Arial" w:hAnsi="Arial"/>
+          <w:sz w:val="20"/>
+          <w:szCs w:val="20"/>
+        </w:rPr>
+        <w:t xml:space="preserve"> On VM/370 a long may have 32 bits. Integers are long, overflow is detected explicitly, and the test suite passes in a 32-bit build (gcc -m32). Integer overflow then happens at 2147483647.</w:t>
+      </w:r>
+    </w:p>
+    <w:p>
+      <w:pPr>
+        <w:pStyle w:val="ListParagraph"/>
+        <w:numPr>
+          <w:ilvl w:val="0"/>
+          <w:numId w:val="2"/>
+        </w:numPr>
+        <w:spacing w:after="80"/>
+      </w:pPr>
+      <w:r>
+        <w:rPr>
+          <w:rFonts w:ascii="Arial" w:cs="Arial" w:eastAsia="Arial" w:hAnsi="Arial"/>
+          <w:b/>
+          <w:bCs/>
+          <w:sz w:val="20"/>
+          <w:szCs w:val="20"/>
+        </w:rPr>
+        <w:t xml:space="preserve">No operating system services</w:t>
+      </w:r>
+      <w:r>
+        <w:rPr>
+          <w:rFonts w:ascii="Arial" w:cs="Arial" w:eastAsia="Arial" w:hAnsi="Arial"/>
+          <w:sz w:val="20"/>
+          <w:szCs w:val="20"/>
+        </w:rPr>
+        <w:t xml:space="preserve"> except, with -DSNO_POSIX, gettimeofday for TIME().</w:t>
+      </w:r>
+    </w:p>
+    <w:p>
+      <w:pPr>
+        <w:pStyle w:val="ListParagraph"/>
+        <w:numPr>
+          <w:ilvl w:val="0"/>
+          <w:numId w:val="2"/>
+        </w:numPr>
+        <w:spacing w:after="80"/>
+      </w:pPr>
+      <w:r>
+        <w:rPr>
+          <w:rFonts w:ascii="Arial" w:cs="Arial" w:eastAsia="Arial" w:hAnsi="Arial"/>
+          <w:b/>
+          <w:bCs/>
+          <w:sz w:val="20"/>
+          <w:szCs w:val="20"/>
+        </w:rPr>
+        <w:t xml:space="preserve">Card images.</w:t>
+      </w:r>
+      <w:r>
+        <w:rPr>
+          <w:rFonts w:ascii="Arial" w:cs="Arial" w:eastAsia="Arial" w:hAnsi="Arial"/>
+          <w:sz w:val="20"/>
+          <w:szCs w:val="20"/>
+        </w:rPr>
+        <w:t xml:space="preserve"> tools/deck.py folds the amalgamated file to 71 columns without changing the token stream, and checks the result, for the VM/370 build.</w:t>
+      </w:r>
+    </w:p>
+    <w:p>
+      <w:pPr>
+        <w:pStyle w:val="ListParagraph"/>
+        <w:numPr>
+          <w:ilvl w:val="0"/>
+          <w:numId w:val="2"/>
+        </w:numPr>
+        <w:spacing w:after="80"/>
+      </w:pPr>
+      <w:r>
+        <w:rPr>
+          <w:rFonts w:ascii="Arial" w:cs="Arial" w:eastAsia="Arial" w:hAnsi="Arial"/>
+          <w:b/>
+          <w:bCs/>
+          <w:sz w:val="20"/>
+          <w:szCs w:val="20"/>
+        </w:rPr>
+        <w:t xml:space="preserve">Checked</w:t>
+      </w:r>
+      <w:r>
+        <w:rPr>
+          <w:rFonts w:ascii="Arial" w:cs="Arial" w:eastAsia="Arial" w:hAnsi="Arial"/>
+          <w:sz w:val="20"/>
+          <w:szCs w:val="20"/>
+        </w:rPr>
+        <w:t xml:space="preserve"> with AddressSanitizer and UBSan on all tests and on a differential comparison against the CREXX version: about forty hand-written programs and 1500 random expressions.</w:t>
+      </w:r>
+    </w:p>
+    <w:p>
+      <w:pPr>
+        <w:pStyle w:val="Heading2"/>
+        <w:keepNext/>
+      </w:pPr>
+      <w:r>
+        <w:rPr>
+          <w:rFonts w:ascii="Arial" w:cs="Arial" w:eastAsia="Arial" w:hAnsi="Arial"/>
+          <w:b/>
+          <w:bCs/>
+          <w:sz w:val="24"/>
+          <w:szCs w:val="24"/>
+        </w:rPr>
+        <w:t xml:space="preserve">Numbers and output</w:t>
+      </w:r>
+    </w:p>
+    <w:p>
+      <w:pPr>
+        <w:spacing w:after="120" w:line="264"/>
+      </w:pPr>
+      <w:r>
+        <w:rPr>
+          <w:rFonts w:ascii="Arial" w:cs="Arial" w:eastAsia="Arial" w:hAnsi="Arial"/>
+          <w:sz w:val="20"/>
+          <w:szCs w:val="20"/>
+        </w:rPr>
+        <w:t xml:space="preserve">Real numbers print exactly as the CREXX version prints them: at most 15 significant digits, trailing zeros removed, plain notation for exponents from -6 up to 17 and d.ddddE+XX beyond, then the SNOBOL conventions of a decimal point and an upper case E (3., 0.3, 1.E+20, 1.5E-10, inf.). The algorithm is the one of the CREXX run-time library. Integer overflow, which the CREXX virtual machine does not report, is imitated as described in Chapter 10, so that programs that overflow print the same numbers with both versions.</w:t>
+      </w:r>
+    </w:p>
+    <w:p>
+      <w:pPr>
+        <w:pStyle w:val="Heading2"/>
+        <w:keepNext/>
+      </w:pPr>
+      <w:r>
+        <w:rPr>
+          <w:rFonts w:ascii="Arial" w:cs="Arial" w:eastAsia="Arial" w:hAnsi="Arial"/>
+          <w:b/>
+          <w:bCs/>
+          <w:sz w:val="24"/>
+          <w:szCs w:val="24"/>
+        </w:rPr>
+        <w:t xml:space="preserve">Differences from the CREXX version</w:t>
+      </w:r>
+    </w:p>
+    <w:p>
+      <w:pPr>
+        <w:pStyle w:val="ListParagraph"/>
+        <w:numPr>
+          <w:ilvl w:val="0"/>
+          <w:numId w:val="2"/>
+        </w:numPr>
+        <w:spacing w:after="80"/>
+      </w:pPr>
+      <w:r>
+        <w:rPr>
+          <w:rFonts w:ascii="Arial" w:cs="Arial" w:eastAsia="Arial" w:hAnsi="Arial"/>
+          <w:b/>
+          <w:bCs/>
+          <w:sz w:val="20"/>
+          <w:szCs w:val="20"/>
+        </w:rPr>
+        <w:t xml:space="preserve">Bytes, not characters.</w:t>
+      </w:r>
+      <w:r>
+        <w:rPr>
+          <w:rFonts w:ascii="Arial" w:cs="Arial" w:eastAsia="Arial" w:hAnsi="Arial"/>
+          <w:sz w:val="20"/>
+          <w:szCs w:val="20"/>
+        </w:rPr>
+        <w:t xml:space="preserve"> CREXX strings are UTF-8 and SIZE and SUBSTR count code points; the C version counts bytes. &amp;ALPHABET is the 256 raw bytes. ASCII text behaves identically.</w:t>
+      </w:r>
+    </w:p>
+    <w:p>
+      <w:pPr>
+        <w:pStyle w:val="ListParagraph"/>
+        <w:numPr>
+          <w:ilvl w:val="0"/>
+          <w:numId w:val="2"/>
+        </w:numPr>
+        <w:spacing w:after="80"/>
+      </w:pPr>
+      <w:r>
+        <w:rPr>
+          <w:rFonts w:ascii="Arial" w:cs="Arial" w:eastAsia="Arial" w:hAnsi="Arial"/>
+          <w:b/>
+          <w:bCs/>
+          <w:sz w:val="20"/>
+          <w:szCs w:val="20"/>
+        </w:rPr>
+        <w:t xml:space="preserve">Defects that are not copied.</w:t>
+      </w:r>
+      <w:r>
+        <w:rPr>
+          <w:rFonts w:ascii="Arial" w:cs="Arial" w:eastAsia="Arial" w:hAnsi="Arial"/>
+          <w:sz w:val="20"/>
+          <w:szCs w:val="20"/>
+        </w:rPr>
+        <w:t xml:space="preserve"> ITEM on arrays, EVAL of an unevaluated expression, and the numeric conversion panics described in Chapter 10 work in the C version.</w:t>
+      </w:r>
+    </w:p>
+    <w:p>
+      <w:pPr>
+        <w:pStyle w:val="ListParagraph"/>
+        <w:numPr>
+          <w:ilvl w:val="0"/>
+          <w:numId w:val="2"/>
+        </w:numPr>
+        <w:spacing w:after="80"/>
+      </w:pPr>
+      <w:r>
+        <w:rPr>
+          <w:rFonts w:ascii="Arial" w:cs="Arial" w:eastAsia="Arial" w:hAnsi="Arial"/>
+          <w:b/>
+          <w:bCs/>
+          <w:sz w:val="20"/>
+          <w:szCs w:val="20"/>
+        </w:rPr>
+        <w:t xml:space="preserve">TIME()</w:t>
+      </w:r>
+      <w:r>
+        <w:rPr>
+          <w:rFonts w:ascii="Arial" w:cs="Arial" w:eastAsia="Arial" w:hAnsi="Arial"/>
+          <w:sz w:val="20"/>
+          <w:szCs w:val="20"/>
+        </w:rPr>
+        <w:t xml:space="preserve"> returns elapsed milliseconds with SNO_POSIX and processor time otherwise.</w:t>
+      </w:r>
+    </w:p>
+    <w:p>
+      <w:pPr>
+        <w:pStyle w:val="ListParagraph"/>
+        <w:numPr>
+          <w:ilvl w:val="0"/>
+          <w:numId w:val="2"/>
+        </w:numPr>
+        <w:spacing w:after="80"/>
+      </w:pPr>
+      <w:r>
+        <w:rPr>
+          <w:rFonts w:ascii="Arial" w:cs="Arial" w:eastAsia="Arial" w:hAnsi="Arial"/>
+          <w:b/>
+          <w:bCs/>
+          <w:sz w:val="20"/>
+          <w:szCs w:val="20"/>
+        </w:rPr>
+        <w:t xml:space="preserve">Floating point.</w:t>
+      </w:r>
+      <w:r>
+        <w:rPr>
+          <w:rFonts w:ascii="Arial" w:cs="Arial" w:eastAsia="Arial" w:hAnsi="Arial"/>
+          <w:sz w:val="20"/>
+          <w:szCs w:val="20"/>
+        </w:rPr>
+        <w:t xml:space="preserve"> The last digit of results of SIN, EXP, ** and the like depends on the host's mathematical library; on IEEE hosts it agrees with CREXX. A VM/370 build uses hexadecimal floating point, where the 15 printed digits can differ in the last place.</w:t>
+      </w:r>
+    </w:p>
+    <w:p>
+      <w:pPr>
+        <w:pStyle w:val="Heading2"/>
+        <w:keepNext/>
+      </w:pPr>
+      <w:r>
+        <w:rPr>
+          <w:rFonts w:ascii="Arial" w:cs="Arial" w:eastAsia="Arial" w:hAnsi="Arial"/>
+          <w:b/>
+          <w:bCs/>
+          <w:sz w:val="24"/>
+          <w:szCs w:val="24"/>
+        </w:rPr>
+        <w:t xml:space="preserve">Benchmarks</w:t>
+      </w:r>
+    </w:p>
+    <w:p>
+      <w:pPr>
+        <w:spacing w:after="120" w:line="264"/>
+      </w:pPr>
+      <w:r>
+        <w:rPr>
+          <w:rFonts w:ascii="Arial" w:cs="Arial" w:eastAsia="Arial" w:hAnsi="Arial"/>
+          <w:sz w:val="20"/>
+          <w:szCs w:val="20"/>
+        </w:rPr>
+        <w:t xml:space="preserve">The directory bench holds four deterministic programs that both versions run with identical output: loops (integer and real arithmetic, Collatz, gcd), strings (concatenation, SPAN, BREAK, ARBNO, BAL and replacement), tables (inserts, lookups, SORT, arrays) and recursion (Fibonacci, Ackermann, Towers of Hanoi, permutations through DEFINE). sh bench/run.sh runs them and compares the output with the stored results; the C version needs between 0.02 and 0.12 seconds for each, the CREXX version between 2 and 7.</w:t>
+      </w:r>
+    </w:p>
+    <w:p>
+      <w:pPr>
+        <w:pStyle w:val="Heading1"/>
+        <w:pageBreakBefore/>
+        <w:pBdr>
+          <w:bottom w:val="single" w:color="000000" w:sz="12" w:space="4"/>
+        </w:pBdr>
+        <w:spacing w:after="240" w:before="0"/>
+      </w:pPr>
+      <w:r>
+        <w:rPr>
+          <w:rFonts w:ascii="Arial" w:cs="Arial" w:eastAsia="Arial" w:hAnsi="Arial"/>
+          <w:b/>
+          <w:bCs/>
+          <w:sz w:val="32"/>
+          <w:szCs w:val="32"/>
+        </w:rPr>
+        <w:t xml:space="preserve">Appendix A. Command Summary</w:t>
+      </w:r>
+    </w:p>
+    <w:p>
+      <w:pPr>
+        <w:keepNext/>
+        <w:keepLines/>
+        <w:pBdr>
+          <w:top w:val="single" w:color="808080" w:sz="4"/>
+          <w:left w:val="single" w:color="808080" w:sz="4"/>
+          <w:right w:val="single" w:color="808080" w:sz="4"/>
+        </w:pBdr>
+        <w:shd w:fill="F2F2F2" w:color="auto" w:val="clear"/>
+        <w:spacing w:after="0" w:line="240"/>
+        <w:ind w:left="100" w:right="100"/>
+      </w:pPr>
+      <w:r>
+        <w:rPr>
+          <w:rFonts w:ascii="Courier New" w:cs="Courier New" w:eastAsia="Courier New" w:hAnsi="Courier New"/>
+          <w:sz w:val="17"/>
+          <w:szCs w:val="17"/>
+        </w:rPr>
+        <w:t xml:space="preserve">./snobol [-f] program.sno</w:t>
+      </w:r>
+    </w:p>
+    <w:p>
+      <w:pPr>
+        <w:keepNext/>
+        <w:keepLines/>
+        <w:pBdr>
+          <w:left w:val="single" w:color="808080" w:sz="4"/>
+          <w:right w:val="single" w:color="808080" w:sz="4"/>
+        </w:pBdr>
+        <w:shd w:fill="F2F2F2" w:color="auto" w:val="clear"/>
+        <w:spacing w:after="0" w:line="240"/>
+        <w:ind w:left="100" w:right="100"/>
+      </w:pPr>
+      <w:r>
+        <w:rPr>
+          <w:rFonts w:ascii="Courier New" w:cs="Courier New" w:eastAsia="Courier New" w:hAnsi="Courier New"/>
+          <w:sz w:val="17"/>
+          <w:szCs w:val="17"/>
+        </w:rPr>
+        <w:t xml:space="preserve">crexx snobol.crexx -nocompile -args [-f] program.sno</w:t>
+      </w:r>
+    </w:p>
+    <w:p>
+      <w:pPr>
+        <w:keepNext/>
+        <w:keepLines/>
+        <w:pBdr>
+          <w:left w:val="single" w:color="808080" w:sz="4"/>
+          <w:right w:val="single" w:color="808080" w:sz="4"/>
+        </w:pBdr>
+        <w:shd w:fill="F2F2F2" w:color="auto" w:val="clear"/>
+        <w:spacing w:after="0" w:line="240"/>
+        <w:ind w:left="100" w:right="100"/>
+      </w:pPr>
+      <w:r>
+        <w:rPr>
+          <w:rFonts w:ascii="Courier New" w:cs="Courier New" w:eastAsia="Courier New" w:hAnsi="Courier New"/>
+          <w:sz w:val="17"/>
+          <w:szCs w:val="17"/>
+        </w:rPr>
+        <w:t xml:space="preserve"> </w:t>
+      </w:r>
+    </w:p>
+    <w:p>
+      <w:pPr>
+        <w:keepNext/>
+        <w:keepLines/>
+        <w:pBdr>
+          <w:left w:val="single" w:color="808080" w:sz="4"/>
+          <w:right w:val="single" w:color="808080" w:sz="4"/>
+        </w:pBdr>
+        <w:shd w:fill="F2F2F2" w:color="auto" w:val="clear"/>
+        <w:spacing w:after="0" w:line="240"/>
+        <w:ind w:left="100" w:right="100"/>
+      </w:pPr>
+      <w:r>
+        <w:rPr>
+          <w:rFonts w:ascii="Courier New" w:cs="Courier New" w:eastAsia="Courier New" w:hAnsi="Courier New"/>
+          <w:sz w:val="17"/>
+          <w:szCs w:val="17"/>
+        </w:rPr>
+        <w:t xml:space="preserve">-f   fold names to upper case</w:t>
+      </w:r>
+    </w:p>
+    <w:p>
+      <w:pPr>
+        <w:keepNext w:val="false"/>
+        <w:keepLines/>
+        <w:pBdr>
+          <w:bottom w:val="single" w:color="808080" w:sz="4"/>
+          <w:left w:val="single" w:color="808080" w:sz="4"/>
+          <w:right w:val="single" w:color="808080" w:sz="4"/>
+        </w:pBdr>
+        <w:shd w:fill="F2F2F2" w:color="auto" w:val="clear"/>
+        <w:spacing w:after="0" w:line="240"/>
+        <w:ind w:left="100" w:right="100"/>
+      </w:pPr>
+      <w:r>
+        <w:rPr>
+          <w:rFonts w:ascii="Courier New" w:cs="Courier New" w:eastAsia="Courier New" w:hAnsi="Courier New"/>
+          <w:sz w:val="17"/>
+          <w:szCs w:val="17"/>
+        </w:rPr>
+        <w:t xml:space="preserve">-h   show usage</w:t>
+      </w:r>
+    </w:p>
+    <w:p>
+      <w:pPr>
+        <w:spacing w:after="200" w:before="60"/>
+      </w:pPr>
+      <w:r>
+        <w:rPr>
+          <w:rFonts w:ascii="Arial" w:cs="Arial" w:eastAsia="Arial" w:hAnsi="Arial"/>
+          <w:b/>
+          <w:bCs/>
+          <w:sz w:val="18"/>
+          <w:szCs w:val="18"/>
+        </w:rPr>
+        <w:t xml:space="preserve">Figure 39. </w:t>
       </w:r>
       <w:r>
         <w:rPr>
@@ -19603,6 +20447,146 @@
                 <w:sz w:val="17"/>
                 <w:szCs w:val="17"/>
               </w:rPr>
+              <w:t xml:space="preserve">c/</w:t>
+            </w:r>
+          </w:p>
+        </w:tc>
+        <w:tc>
+          <w:tcPr>
+            <w:tcW w:type="dxa" w:w="7238"/>
+            <w:tcBorders>
+              <w:top w:val="single" w:color="808080" w:sz="4"/>
+              <w:left w:val="single" w:color="808080" w:sz="4"/>
+              <w:bottom w:val="single" w:color="808080" w:sz="4"/>
+              <w:right w:val="single" w:color="808080" w:sz="4"/>
+            </w:tcBorders>
+            <w:tcMar>
+              <w:top w:type="dxa" w:w="50"/>
+              <w:left w:type="dxa" w:w="90"/>
+              <w:bottom w:type="dxa" w:w="50"/>
+              <w:right w:type="dxa" w:w="90"/>
+            </w:tcMar>
+          </w:tcPr>
+          <w:p>
+            <w:pPr>
+              <w:spacing w:after="0"/>
+            </w:pPr>
+            <w:r>
+              <w:rPr>
+                <w:rFonts w:ascii="Arial" w:cs="Arial" w:eastAsia="Arial" w:hAnsi="Arial"/>
+                <w:b w:val="false"/>
+                <w:bCs w:val="false"/>
+                <w:sz w:val="17"/>
+                <w:szCs w:val="17"/>
+              </w:rPr>
+              <w:t xml:space="preserve">The portable C89 version: sources in c/src, the amalgamated snobol_all.c, the card deck, Makefile, tools and tests/run_tests.sh.</w:t>
+            </w:r>
+          </w:p>
+        </w:tc>
+      </w:tr>
+      <w:tr>
+        <w:trPr>
+          <w:cantSplit/>
+          <w:tblHeader w:val="false"/>
+        </w:trPr>
+        <w:tc>
+          <w:tcPr>
+            <w:tcW w:type="dxa" w:w="2400"/>
+            <w:tcBorders>
+              <w:top w:val="single" w:color="808080" w:sz="4"/>
+              <w:left w:val="single" w:color="808080" w:sz="4"/>
+              <w:bottom w:val="single" w:color="808080" w:sz="4"/>
+              <w:right w:val="single" w:color="808080" w:sz="4"/>
+            </w:tcBorders>
+            <w:tcMar>
+              <w:top w:type="dxa" w:w="50"/>
+              <w:left w:type="dxa" w:w="90"/>
+              <w:bottom w:type="dxa" w:w="50"/>
+              <w:right w:type="dxa" w:w="90"/>
+            </w:tcMar>
+          </w:tcPr>
+          <w:p>
+            <w:pPr>
+              <w:spacing w:after="0"/>
+            </w:pPr>
+            <w:r>
+              <w:rPr>
+                <w:rFonts w:ascii="Arial" w:cs="Arial" w:eastAsia="Arial" w:hAnsi="Arial"/>
+                <w:b w:val="false"/>
+                <w:bCs w:val="false"/>
+                <w:sz w:val="17"/>
+                <w:szCs w:val="17"/>
+              </w:rPr>
+              <w:t xml:space="preserve">bench/</w:t>
+            </w:r>
+          </w:p>
+        </w:tc>
+        <w:tc>
+          <w:tcPr>
+            <w:tcW w:type="dxa" w:w="7238"/>
+            <w:tcBorders>
+              <w:top w:val="single" w:color="808080" w:sz="4"/>
+              <w:left w:val="single" w:color="808080" w:sz="4"/>
+              <w:bottom w:val="single" w:color="808080" w:sz="4"/>
+              <w:right w:val="single" w:color="808080" w:sz="4"/>
+            </w:tcBorders>
+            <w:tcMar>
+              <w:top w:type="dxa" w:w="50"/>
+              <w:left w:type="dxa" w:w="90"/>
+              <w:bottom w:type="dxa" w:w="50"/>
+              <w:right w:type="dxa" w:w="90"/>
+            </w:tcMar>
+          </w:tcPr>
+          <w:p>
+            <w:pPr>
+              <w:spacing w:after="0"/>
+            </w:pPr>
+            <w:r>
+              <w:rPr>
+                <w:rFonts w:ascii="Arial" w:cs="Arial" w:eastAsia="Arial" w:hAnsi="Arial"/>
+                <w:b w:val="false"/>
+                <w:bCs w:val="false"/>
+                <w:sz w:val="17"/>
+                <w:szCs w:val="17"/>
+              </w:rPr>
+              <w:t xml:space="preserve">Benchmark programs (loops, strings, tables, recursion) with their expected output and run.sh.</w:t>
+            </w:r>
+          </w:p>
+        </w:tc>
+      </w:tr>
+      <w:tr>
+        <w:trPr>
+          <w:cantSplit/>
+          <w:tblHeader w:val="false"/>
+        </w:trPr>
+        <w:tc>
+          <w:tcPr>
+            <w:tcW w:type="dxa" w:w="2400"/>
+            <w:tcBorders>
+              <w:top w:val="single" w:color="808080" w:sz="4"/>
+              <w:left w:val="single" w:color="808080" w:sz="4"/>
+              <w:bottom w:val="single" w:color="808080" w:sz="4"/>
+              <w:right w:val="single" w:color="808080" w:sz="4"/>
+            </w:tcBorders>
+            <w:tcMar>
+              <w:top w:type="dxa" w:w="50"/>
+              <w:left w:type="dxa" w:w="90"/>
+              <w:bottom w:type="dxa" w:w="50"/>
+              <w:right w:type="dxa" w:w="90"/>
+            </w:tcMar>
+          </w:tcPr>
+          <w:p>
+            <w:pPr>
+              <w:spacing w:after="0"/>
+            </w:pPr>
+            <w:r>
+              <w:rPr>
+                <w:rFonts w:ascii="Arial" w:cs="Arial" w:eastAsia="Arial" w:hAnsi="Arial"/>
+                <w:b w:val="false"/>
+                <w:bCs w:val="false"/>
+                <w:sz w:val="17"/>
+                <w:szCs w:val="17"/>
+              </w:rPr>
               <w:t xml:space="preserve">README.md</w:t>
             </w:r>
           </w:p>
@@ -19653,7 +20637,7 @@
           <w:sz w:val="18"/>
           <w:szCs w:val="18"/>
         </w:rPr>
-        <w:t xml:space="preserve">Figure 39. </w:t>
+        <w:t xml:space="preserve">Figure 40. </w:t>
       </w:r>
       <w:r>
         <w:rPr>
@@ -21247,7 +22231,7 @@
           <w:sz w:val="18"/>
           <w:szCs w:val="18"/>
         </w:rPr>
-        <w:t xml:space="preserve">Figure 40. </w:t>
+        <w:t xml:space="preserve">Figure 41. </w:t>
       </w:r>
       <w:r>
         <w:rPr>
@@ -21742,7 +22726,7 @@
           <w:sz w:val="18"/>
           <w:szCs w:val="18"/>
         </w:rPr>
-        <w:t xml:space="preserve">Figure 41. </w:t>
+        <w:t xml:space="preserve">Figure 42. </w:t>
       </w:r>
       <w:r>
         <w:rPr>

</xml_diff>